<commit_message>
Update social media downloads
</commit_message>
<xml_diff>
--- a/downloads/kosmiczne-laboratorium-podsumowanie-i-linki-2026-06-14.docx
+++ b/downloads/kosmiczne-laboratorium-podsumowanie-i-linki-2026-06-14.docx
@@ -114,7 +114,7 @@
                 <w:color w:val="172033"/>
                 <w:sz w:val="20"/>
               </w:rPr>
-              <w:t>14 czerwca 2026</w:t>
+              <w:t>15 czerwca 2026</w:t>
             </w:r>
           </w:p>
         </w:tc>
@@ -170,7 +170,7 @@
                 <w:color w:val="172033"/>
                 <w:sz w:val="20"/>
               </w:rPr>
-              <w:t>45 paczek · 225 Stories · 90 obrazów do postów</w:t>
+              <w:t>46 paczek · 230 Stories · 92 obrazy do postów</w:t>
             </w:r>
           </w:p>
         </w:tc>
@@ -791,7 +791,7 @@
                 <w:color w:val="172033"/>
                 <w:sz w:val="18"/>
               </w:rPr>
-              <w:t>45 paczek w lżejszym JPG</w:t>
+              <w:t>46 paczek w lżejszym JPG</w:t>
             </w:r>
           </w:p>
         </w:tc>
@@ -1370,7 +1370,7 @@
                 <w:color w:val="172033"/>
                 <w:sz w:val="18"/>
               </w:rPr>
-              <w:t>67 nagrań jest częścią aplikacji</w:t>
+              <w:t>Zapis prowadzi do następnej misji albo do zeszytu</w:t>
             </w:r>
           </w:p>
         </w:tc>
@@ -1428,7 +1428,7 @@
                 <w:color w:val="172033"/>
                 <w:sz w:val="18"/>
               </w:rPr>
-              <w:t>Mały magnes może zatrzymać spadanie spinacza</w:t>
+              <w:t>67 nagrań jest częścią aplikacji</w:t>
             </w:r>
           </w:p>
         </w:tc>
@@ -1576,7 +1576,7 @@
                 <w:color w:val="071126"/>
                 <w:sz w:val="34"/>
               </w:rPr>
-              <w:t>45</w:t>
+              <w:t>46</w:t>
             </w:r>
             <w:r>
               <w:rPr>
@@ -1614,7 +1614,7 @@
                 <w:color w:val="071126"/>
                 <w:sz w:val="34"/>
               </w:rPr>
-              <w:t>225</w:t>
+              <w:t>230</w:t>
             </w:r>
             <w:r>
               <w:rPr>
@@ -1652,7 +1652,7 @@
                 <w:color w:val="071126"/>
                 <w:sz w:val="34"/>
               </w:rPr>
-              <w:t>90</w:t>
+              <w:t>92</w:t>
             </w:r>
             <w:r>
               <w:rPr>
@@ -2123,7 +2123,7 @@
           <w:color w:val="172033"/>
           <w:sz w:val="22"/>
         </w:rPr>
-        <w:t>Ostatni wynik: 45 paczek, 225 Stories, 90 grafik do postów, 0 błędów i 0 ostrzeżeń.</w:t>
+        <w:t>Ostatni wynik: 46 paczek, 230 Stories, 92 grafiki do postów, 0 błędów i 0 ostrzeżeń.</w:t>
       </w:r>
     </w:p>
     <w:p>
@@ -2191,7 +2191,7 @@
                 <w:color w:val="1F4D78"/>
                 <w:sz w:val="20"/>
               </w:rPr>
-              <w:t>Narracja</w:t>
+              <w:t>Po zapisie</w:t>
             </w:r>
           </w:p>
         </w:tc>
@@ -2217,7 +2217,7 @@
                 <w:color w:val="172033"/>
                 <w:sz w:val="20"/>
               </w:rPr>
-              <w:t>67 nagrań w paczce aplikacji i prywatny, lokalny głos awaryjny.</w:t>
+              <w:t>Po 3 z 6 aplikacja prowadzi do kolejnej misji, a po 6 z 6 do zeszytu.</w:t>
             </w:r>
           </w:p>
         </w:tc>
@@ -2247,7 +2247,7 @@
                 <w:color w:val="1F4D78"/>
                 <w:sz w:val="20"/>
               </w:rPr>
-              <w:t>Magnes + grawitacja</w:t>
+              <w:t>Narracja</w:t>
             </w:r>
           </w:p>
         </w:tc>
@@ -2273,7 +2273,7 @@
                 <w:color w:val="172033"/>
                 <w:sz w:val="20"/>
               </w:rPr>
-              <w:t>Ten sam stalowy spinacz pod wpływem dwóch sił; magnes nie wyłącza grawitacji.</w:t>
+              <w:t>67 nagrań w paczce aplikacji i prywatny, lokalny głos awaryjny.</w:t>
             </w:r>
           </w:p>
         </w:tc>
@@ -2989,7 +2989,7 @@
                 <w:color w:val="172033"/>
                 <w:sz w:val="18"/>
               </w:rPr>
-              <w:t>45 ZIP-ów + ZIP zbiorczy</w:t>
+              <w:t>46 ZIP-ów + ZIP zbiorczy</w:t>
             </w:r>
           </w:p>
         </w:tc>
@@ -3769,7 +3769,7 @@
         <w:color w:val="586273"/>
         <w:sz w:val="17"/>
       </w:rPr>
-      <w:t>Podsumowanie i linki · 14 czerwca 2026</w:t>
+      <w:t>Podsumowanie i linki · 15 czerwca 2026</w:t>
     </w:r>
   </w:p>
 </w:hdr>

</xml_diff>